<commit_message>
Expand final user manual
</commit_message>
<xml_diff>
--- a/output/final-defense/06-用户使用手册.docx
+++ b/output/final-defense/06-用户使用手册.docx
@@ -33,7 +33,7 @@
         <w:pStyle w:val="Heading1"/>
       </w:pPr>
       <w:r>
-        <w:t>1. 启动系统</w:t>
+        <w:t>1. 启动与登录</w:t>
       </w:r>
     </w:p>
     <w:p>
@@ -41,7 +41,7 @@
         <w:pStyle w:val="ListNumber"/>
       </w:pPr>
       <w:r>
-        <w:t>在项目根目录执行 .\scripts\start-demo.ps1。</w:t>
+        <w:t>在项目根目录执行 .\scripts\start-demo.ps1。若端口被占用，可使用 -BackendPort 和 -FrontendPort 参数指定备用端口。</w:t>
       </w:r>
     </w:p>
     <w:p>
@@ -49,7 +49,7 @@
         <w:pStyle w:val="ListNumber"/>
       </w:pPr>
       <w:r>
-        <w:t>浏览器访问 http://localhost:5173。</w:t>
+        <w:t>浏览器访问 http://localhost:5173。默认管理员账号为 admin / 123456；演示环境也可使用 start-demo.ps1 输出的 demo_* 账号。</w:t>
       </w:r>
     </w:p>
     <w:p>
@@ -57,7 +57,66 @@
         <w:pStyle w:val="ListNumber"/>
       </w:pPr>
       <w:r>
-        <w:t>使用 admin / 123456 或演示账号登录。</w:t>
+        <w:t>登录后系统会根据 JWT 中的用户身份加载当前用户，再由后端权限接口返回角色与权限点。没有权限的菜单不会显示，直接访问无权限路由会被重定向到工作台。</w:t>
+      </w:r>
+    </w:p>
+    <w:p>
+      <w:pPr>
+        <w:pStyle w:val="ListNumber"/>
+      </w:pPr>
+      <w:r>
+        <w:t>进入工作台后先查看合同总数、待办任务、状态分布和月度合同量，确认后端、前端、统计接口和权限数据均已正常加载。</w:t>
+      </w:r>
+    </w:p>
+    <w:p>
+      <w:pPr>
+        <w:jc w:val="center"/>
+      </w:pPr>
+      <w:r>
+        <w:drawing>
+          <wp:inline xmlns:a="http://schemas.openxmlformats.org/drawingml/2006/main" xmlns:pic="http://schemas.openxmlformats.org/drawingml/2006/picture">
+            <wp:extent cx="5760720" cy="4402150"/>
+            <wp:docPr id="1" name="Picture 1"/>
+            <wp:cNvGraphicFramePr>
+              <a:graphicFrameLocks noChangeAspect="1"/>
+            </wp:cNvGraphicFramePr>
+            <a:graphic>
+              <a:graphicData uri="http://schemas.openxmlformats.org/drawingml/2006/picture">
+                <pic:pic>
+                  <pic:nvPicPr>
+                    <pic:cNvPr id="0" name="01-dashboard-statistics.jpg"/>
+                    <pic:cNvPicPr/>
+                  </pic:nvPicPr>
+                  <pic:blipFill>
+                    <a:blip r:embed="rId10"/>
+                    <a:stretch>
+                      <a:fillRect/>
+                    </a:stretch>
+                  </pic:blipFill>
+                  <pic:spPr>
+                    <a:xfrm>
+                      <a:off x="0" y="0"/>
+                      <a:ext cx="5760720" cy="4402150"/>
+                    </a:xfrm>
+                    <a:prstGeom prst="rect"/>
+                  </pic:spPr>
+                </pic:pic>
+              </a:graphicData>
+            </a:graphic>
+          </wp:inline>
+        </w:drawing>
+      </w:r>
+    </w:p>
+    <w:p>
+      <w:pPr>
+        <w:jc w:val="center"/>
+      </w:pPr>
+      <w:r>
+        <w:rPr>
+          <w:color w:val="64748B"/>
+          <w:sz w:val="17"/>
+        </w:rPr>
+        <w:t>图 1 工作台：统计卡片、状态分布、月度合同量和最近合同</w:t>
       </w:r>
     </w:p>
     <w:p>
@@ -65,7 +124,12 @@
         <w:pStyle w:val="Heading1"/>
       </w:pPr>
       <w:r>
-        <w:t>2. 基本使用</w:t>
+        <w:t>2. 模板管理演示</w:t>
+      </w:r>
+    </w:p>
+    <w:p>
+      <w:r>
+        <w:t>模板库用于沉淀标准合同文件。合同管理员可以上传、启停、删除模板，并设置可见角色；普通起草人进入模板库时只能看到自己角色可见且已启用的模板。</w:t>
       </w:r>
     </w:p>
     <w:p>
@@ -73,7 +137,7 @@
         <w:pStyle w:val="ListNumber"/>
       </w:pPr>
       <w:r>
-        <w:t>进入客户管理，新增或选择客户。</w:t>
+        <w:t>使用管理员或合同管理员账号进入“模板库”。</w:t>
       </w:r>
     </w:p>
     <w:p>
@@ -81,7 +145,7 @@
         <w:pStyle w:val="ListNumber"/>
       </w:pPr>
       <w:r>
-        <w:t>进入模板管理，上传或启用合同模板。</w:t>
+        <w:t>填写模板名称、说明、摘要，勾选可见角色；如不勾选角色，则模板对全部角色可见。</w:t>
       </w:r>
     </w:p>
     <w:p>
@@ -89,7 +153,7 @@
         <w:pStyle w:val="ListNumber"/>
       </w:pPr>
       <w:r>
-        <w:t>进入合同管理，点击起草合同，填写合同信息并上传附件。</w:t>
+        <w:t>选择 doc/docx/jpg/png/pdf 等受支持文件。系统会校验扩展名和文件内容签名，避免伪造扩展名的文件进入模板库。</w:t>
       </w:r>
     </w:p>
     <w:p>
@@ -97,7 +161,7 @@
         <w:pStyle w:val="ListNumber"/>
       </w:pPr>
       <w:r>
-        <w:t>合同管理员在详情页分配会签、审批和签订人员。</w:t>
+        <w:t>上传后在列表中查看模板名称、说明、原始文件名、文件大小、可见角色和启用状态；可点击下载验证文件保存正确。</w:t>
       </w:r>
     </w:p>
     <w:p>
@@ -105,7 +169,71 @@
         <w:pStyle w:val="ListNumber"/>
       </w:pPr>
       <w:r>
-        <w:t>对应人员在我的待办中完成会签、定稿、审批和签订。</w:t>
+        <w:t>停用模板后，起草人侧不再展示该模板；重新启用后恢复可见。</w:t>
+      </w:r>
+    </w:p>
+    <w:p>
+      <w:pPr>
+        <w:jc w:val="center"/>
+      </w:pPr>
+      <w:r>
+        <w:drawing>
+          <wp:inline xmlns:a="http://schemas.openxmlformats.org/drawingml/2006/main" xmlns:pic="http://schemas.openxmlformats.org/drawingml/2006/picture">
+            <wp:extent cx="5760720" cy="4402150"/>
+            <wp:docPr id="2" name="Picture 2"/>
+            <wp:cNvGraphicFramePr>
+              <a:graphicFrameLocks noChangeAspect="1"/>
+            </wp:cNvGraphicFramePr>
+            <a:graphic>
+              <a:graphicData uri="http://schemas.openxmlformats.org/drawingml/2006/picture">
+                <pic:pic>
+                  <pic:nvPicPr>
+                    <pic:cNvPr id="0" name="02-template-management.jpg"/>
+                    <pic:cNvPicPr/>
+                  </pic:nvPicPr>
+                  <pic:blipFill>
+                    <a:blip r:embed="rId11"/>
+                    <a:stretch>
+                      <a:fillRect/>
+                    </a:stretch>
+                  </pic:blipFill>
+                  <pic:spPr>
+                    <a:xfrm>
+                      <a:off x="0" y="0"/>
+                      <a:ext cx="5760720" cy="4402150"/>
+                    </a:xfrm>
+                    <a:prstGeom prst="rect"/>
+                  </pic:spPr>
+                </pic:pic>
+              </a:graphicData>
+            </a:graphic>
+          </wp:inline>
+        </w:drawing>
+      </w:r>
+    </w:p>
+    <w:p>
+      <w:pPr>
+        <w:jc w:val="center"/>
+      </w:pPr>
+      <w:r>
+        <w:rPr>
+          <w:color w:val="64748B"/>
+          <w:sz w:val="17"/>
+        </w:rPr>
+        <w:t>图 2 模板库：上传模板、角色可见性、启停和下载入口</w:t>
+      </w:r>
+    </w:p>
+    <w:p>
+      <w:pPr>
+        <w:pStyle w:val="Heading1"/>
+      </w:pPr>
+      <w:r>
+        <w:t>3. 客户与合同起草</w:t>
+      </w:r>
+    </w:p>
+    <w:p>
+      <w:r>
+        <w:t>合同必须关联客户。实际演示时可先在“客户管理”新增客户，再进入“合同管理 -&gt; 起草合同”。起草页面负责创建合同主数据，附件既可随起草提交，也可在草稿详情页继续维护。</w:t>
       </w:r>
     </w:p>
     <w:p>
@@ -113,7 +241,7 @@
         <w:pStyle w:val="ListNumber"/>
       </w:pPr>
       <w:r>
-        <w:t>如合同被打回，起草人在详情页修改后恢复流程。</w:t>
+        <w:t>填写合同名称、客户、开始日期、结束日期和合同概述。结束日期早于开始日期时，后端会拒绝提交。</w:t>
       </w:r>
     </w:p>
     <w:p>
@@ -121,7 +249,74 @@
         <w:pStyle w:val="ListNumber"/>
       </w:pPr>
       <w:r>
-        <w:t>在查询统计中筛选合同，在日志管理中查看审计记录。</w:t>
+        <w:t>需要参考标准文件时点击“模板库”下载模板，线下拟稿后再作为附件上传。</w:t>
+      </w:r>
+    </w:p>
+    <w:p>
+      <w:pPr>
+        <w:pStyle w:val="ListNumber"/>
+      </w:pPr>
+      <w:r>
+        <w:t>点击“选择附件”可一次选择多个附件，普通起草入口适合小文件随合同一起提交。</w:t>
+      </w:r>
+    </w:p>
+    <w:p>
+      <w:pPr>
+        <w:pStyle w:val="ListNumber"/>
+      </w:pPr>
+      <w:r>
+        <w:t>提交成功后系统生成合同编号、创建合同版本 V1、记录状态历史，并自动生成分配待办。</w:t>
+      </w:r>
+    </w:p>
+    <w:p>
+      <w:pPr>
+        <w:jc w:val="center"/>
+      </w:pPr>
+      <w:r>
+        <w:drawing>
+          <wp:inline xmlns:a="http://schemas.openxmlformats.org/drawingml/2006/main" xmlns:pic="http://schemas.openxmlformats.org/drawingml/2006/picture">
+            <wp:extent cx="5760720" cy="4402150"/>
+            <wp:docPr id="3" name="Picture 3"/>
+            <wp:cNvGraphicFramePr>
+              <a:graphicFrameLocks noChangeAspect="1"/>
+            </wp:cNvGraphicFramePr>
+            <a:graphic>
+              <a:graphicData uri="http://schemas.openxmlformats.org/drawingml/2006/picture">
+                <pic:pic>
+                  <pic:nvPicPr>
+                    <pic:cNvPr id="0" name="03-contract-create.jpg"/>
+                    <pic:cNvPicPr/>
+                  </pic:nvPicPr>
+                  <pic:blipFill>
+                    <a:blip r:embed="rId12"/>
+                    <a:stretch>
+                      <a:fillRect/>
+                    </a:stretch>
+                  </pic:blipFill>
+                  <pic:spPr>
+                    <a:xfrm>
+                      <a:off x="0" y="0"/>
+                      <a:ext cx="5760720" cy="4402150"/>
+                    </a:xfrm>
+                    <a:prstGeom prst="rect"/>
+                  </pic:spPr>
+                </pic:pic>
+              </a:graphicData>
+            </a:graphic>
+          </wp:inline>
+        </w:drawing>
+      </w:r>
+    </w:p>
+    <w:p>
+      <w:pPr>
+        <w:jc w:val="center"/>
+      </w:pPr>
+      <w:r>
+        <w:rPr>
+          <w:color w:val="64748B"/>
+          <w:sz w:val="17"/>
+        </w:rPr>
+        <w:t>图 3 起草合同：基础字段、模板入口和附件选择区域</w:t>
       </w:r>
     </w:p>
     <w:p>
@@ -129,7 +324,52 @@
         <w:pStyle w:val="Heading1"/>
       </w:pPr>
       <w:r>
-        <w:t>3. 常见问题</w:t>
+        <w:t>4. 附件分片续传演示</w:t>
+      </w:r>
+    </w:p>
+    <w:p>
+      <w:r>
+        <w:t>附件页是结题阶段新增能力的重点。系统不是只做普通上传，而是支持分片上传会话：前端按 1MB 切片，后端记录 uploadId、总分片数和已上传分片；中断后前端可查询已上传分片并继续上传，最后 complete 合并为正式附件。</w:t>
+      </w:r>
+    </w:p>
+    <w:p>
+      <w:pPr>
+        <w:pStyle w:val="ListNumber"/>
+      </w:pPr>
+      <w:r>
+        <w:t>进入合同详情页的“附件”页签。只有合同起草人、具备 contract:update 权限且合同处于草稿状态时，才显示“选择文件”。</w:t>
+      </w:r>
+    </w:p>
+    <w:p>
+      <w:pPr>
+        <w:pStyle w:val="ListNumber"/>
+      </w:pPr>
+      <w:r>
+        <w:t>选择文件后前端创建分片上传会话，并把 uploadId 临时保存到 localStorage，用于刷新页面后复用同一个会话。</w:t>
+      </w:r>
+    </w:p>
+    <w:p>
+      <w:pPr>
+        <w:pStyle w:val="ListNumber"/>
+      </w:pPr>
+      <w:r>
+        <w:t>上传过程中进度会按已完成分片百分比显示；如果网络中断，再次选择同一文件时系统先查询已上传分片，只补传缺失分片。</w:t>
+      </w:r>
+    </w:p>
+    <w:p>
+      <w:pPr>
+        <w:pStyle w:val="ListNumber"/>
+      </w:pPr>
+      <w:r>
+        <w:t>合并完成后附件列表展示文件名、大小、上传人、上传时间，并提供预览、下载、删除操作。</w:t>
+      </w:r>
+    </w:p>
+    <w:p>
+      <w:pPr>
+        <w:pStyle w:val="ListNumber"/>
+      </w:pPr>
+      <w:r>
+        <w:t>后端会校验文件大小、扩展名和文件魔数；内容与扩展名不匹配的文件会被拒绝。</w:t>
       </w:r>
     </w:p>
     <w:tbl>
@@ -140,13 +380,1692 @@
         <w:tblLook w:firstColumn="1" w:firstRow="1" w:lastColumn="0" w:lastRow="0" w:noHBand="0" w:noVBand="1" w:val="04A0"/>
       </w:tblPr>
       <w:tblGrid>
-        <w:gridCol w:w="4896"/>
-        <w:gridCol w:w="4896"/>
+        <w:gridCol w:w="3264"/>
+        <w:gridCol w:w="3264"/>
+        <w:gridCol w:w="3264"/>
       </w:tblGrid>
       <w:tr>
         <w:tc>
           <w:tcPr>
-            <w:tcW w:type="dxa" w:w="4896"/>
+            <w:tcW w:type="dxa" w:w="3264"/>
+            <w:shd w:fill="F2F4F7"/>
+            <w:vAlign w:val="center"/>
+          </w:tcPr>
+          <w:p>
+            <w:r/>
+            <w:r>
+              <w:rPr>
+                <w:b/>
+                <w:sz w:val="18"/>
+              </w:rPr>
+              <w:t>接口</w:t>
+            </w:r>
+          </w:p>
+        </w:tc>
+        <w:tc>
+          <w:tcPr>
+            <w:tcW w:type="dxa" w:w="3264"/>
+            <w:shd w:fill="F2F4F7"/>
+            <w:vAlign w:val="center"/>
+          </w:tcPr>
+          <w:p>
+            <w:r/>
+            <w:r>
+              <w:rPr>
+                <w:b/>
+                <w:sz w:val="18"/>
+              </w:rPr>
+              <w:t>用途</w:t>
+            </w:r>
+          </w:p>
+        </w:tc>
+        <w:tc>
+          <w:tcPr>
+            <w:tcW w:type="dxa" w:w="3264"/>
+            <w:shd w:fill="F2F4F7"/>
+            <w:vAlign w:val="center"/>
+          </w:tcPr>
+          <w:p>
+            <w:r/>
+            <w:r>
+              <w:rPr>
+                <w:b/>
+                <w:sz w:val="18"/>
+              </w:rPr>
+              <w:t>演示观察点</w:t>
+            </w:r>
+          </w:p>
+        </w:tc>
+      </w:tr>
+      <w:tr>
+        <w:tc>
+          <w:tcPr>
+            <w:tcW w:type="dxa" w:w="3264"/>
+            <w:vAlign w:val="center"/>
+          </w:tcPr>
+          <w:p>
+            <w:r/>
+            <w:r>
+              <w:rPr>
+                <w:b w:val="0"/>
+                <w:sz w:val="18"/>
+              </w:rPr>
+              <w:t>POST /contracts/{id}/attachments/chunk-session</w:t>
+            </w:r>
+          </w:p>
+        </w:tc>
+        <w:tc>
+          <w:tcPr>
+            <w:tcW w:type="dxa" w:w="3264"/>
+            <w:vAlign w:val="center"/>
+          </w:tcPr>
+          <w:p>
+            <w:r/>
+            <w:r>
+              <w:rPr>
+                <w:b w:val="0"/>
+                <w:sz w:val="18"/>
+              </w:rPr>
+              <w:t>创建上传会话</w:t>
+            </w:r>
+          </w:p>
+        </w:tc>
+        <w:tc>
+          <w:tcPr>
+            <w:tcW w:type="dxa" w:w="3264"/>
+            <w:vAlign w:val="center"/>
+          </w:tcPr>
+          <w:p>
+            <w:r/>
+            <w:r>
+              <w:rPr>
+                <w:b w:val="0"/>
+                <w:sz w:val="18"/>
+              </w:rPr>
+              <w:t>返回 uploadId、chunkSize、totalChunks</w:t>
+            </w:r>
+          </w:p>
+        </w:tc>
+      </w:tr>
+      <w:tr>
+        <w:tc>
+          <w:tcPr>
+            <w:tcW w:type="dxa" w:w="3264"/>
+            <w:vAlign w:val="center"/>
+          </w:tcPr>
+          <w:p>
+            <w:r/>
+            <w:r>
+              <w:rPr>
+                <w:b w:val="0"/>
+                <w:sz w:val="18"/>
+              </w:rPr>
+              <w:t>GET /attachments/chunk-session/{uploadId}</w:t>
+            </w:r>
+          </w:p>
+        </w:tc>
+        <w:tc>
+          <w:tcPr>
+            <w:tcW w:type="dxa" w:w="3264"/>
+            <w:vAlign w:val="center"/>
+          </w:tcPr>
+          <w:p>
+            <w:r/>
+            <w:r>
+              <w:rPr>
+                <w:b w:val="0"/>
+                <w:sz w:val="18"/>
+              </w:rPr>
+              <w:t>查询会话状态</w:t>
+            </w:r>
+          </w:p>
+        </w:tc>
+        <w:tc>
+          <w:tcPr>
+            <w:tcW w:type="dxa" w:w="3264"/>
+            <w:vAlign w:val="center"/>
+          </w:tcPr>
+          <w:p>
+            <w:r/>
+            <w:r>
+              <w:rPr>
+                <w:b w:val="0"/>
+                <w:sz w:val="18"/>
+              </w:rPr>
+              <w:t>返回 uploadedChunks，支持断点续传</w:t>
+            </w:r>
+          </w:p>
+        </w:tc>
+      </w:tr>
+      <w:tr>
+        <w:tc>
+          <w:tcPr>
+            <w:tcW w:type="dxa" w:w="3264"/>
+            <w:vAlign w:val="center"/>
+          </w:tcPr>
+          <w:p>
+            <w:r/>
+            <w:r>
+              <w:rPr>
+                <w:b w:val="0"/>
+                <w:sz w:val="18"/>
+              </w:rPr>
+              <w:t>PUT /attachments/chunk-session/{uploadId}/chunks/{index}</w:t>
+            </w:r>
+          </w:p>
+        </w:tc>
+        <w:tc>
+          <w:tcPr>
+            <w:tcW w:type="dxa" w:w="3264"/>
+            <w:vAlign w:val="center"/>
+          </w:tcPr>
+          <w:p>
+            <w:r/>
+            <w:r>
+              <w:rPr>
+                <w:b w:val="0"/>
+                <w:sz w:val="18"/>
+              </w:rPr>
+              <w:t>上传单个分片</w:t>
+            </w:r>
+          </w:p>
+        </w:tc>
+        <w:tc>
+          <w:tcPr>
+            <w:tcW w:type="dxa" w:w="3264"/>
+            <w:vAlign w:val="center"/>
+          </w:tcPr>
+          <w:p>
+            <w:r/>
+            <w:r>
+              <w:rPr>
+                <w:b w:val="0"/>
+                <w:sz w:val="18"/>
+              </w:rPr>
+              <w:t>缺失分片可单独补传</w:t>
+            </w:r>
+          </w:p>
+        </w:tc>
+      </w:tr>
+      <w:tr>
+        <w:tc>
+          <w:tcPr>
+            <w:tcW w:type="dxa" w:w="3264"/>
+            <w:vAlign w:val="center"/>
+          </w:tcPr>
+          <w:p>
+            <w:r/>
+            <w:r>
+              <w:rPr>
+                <w:b w:val="0"/>
+                <w:sz w:val="18"/>
+              </w:rPr>
+              <w:t>POST /attachments/chunk-session/{uploadId}/complete</w:t>
+            </w:r>
+          </w:p>
+        </w:tc>
+        <w:tc>
+          <w:tcPr>
+            <w:tcW w:type="dxa" w:w="3264"/>
+            <w:vAlign w:val="center"/>
+          </w:tcPr>
+          <w:p>
+            <w:r/>
+            <w:r>
+              <w:rPr>
+                <w:b w:val="0"/>
+                <w:sz w:val="18"/>
+              </w:rPr>
+              <w:t>合并分片</w:t>
+            </w:r>
+          </w:p>
+        </w:tc>
+        <w:tc>
+          <w:tcPr>
+            <w:tcW w:type="dxa" w:w="3264"/>
+            <w:vAlign w:val="center"/>
+          </w:tcPr>
+          <w:p>
+            <w:r/>
+            <w:r>
+              <w:rPr>
+                <w:b w:val="0"/>
+                <w:sz w:val="18"/>
+              </w:rPr>
+              <w:t>生成正式附件记录</w:t>
+            </w:r>
+          </w:p>
+        </w:tc>
+      </w:tr>
+    </w:tbl>
+    <w:p/>
+    <w:p>
+      <w:pPr>
+        <w:jc w:val="center"/>
+      </w:pPr>
+      <w:r>
+        <w:drawing>
+          <wp:inline xmlns:a="http://schemas.openxmlformats.org/drawingml/2006/main" xmlns:pic="http://schemas.openxmlformats.org/drawingml/2006/picture">
+            <wp:extent cx="5760720" cy="4402150"/>
+            <wp:docPr id="4" name="Picture 4"/>
+            <wp:cNvGraphicFramePr>
+              <a:graphicFrameLocks noChangeAspect="1"/>
+            </wp:cNvGraphicFramePr>
+            <a:graphic>
+              <a:graphicData uri="http://schemas.openxmlformats.org/drawingml/2006/picture">
+                <pic:pic>
+                  <pic:nvPicPr>
+                    <pic:cNvPr id="0" name="04-chunk-attachment-list.jpg"/>
+                    <pic:cNvPicPr/>
+                  </pic:nvPicPr>
+                  <pic:blipFill>
+                    <a:blip r:embed="rId13"/>
+                    <a:stretch>
+                      <a:fillRect/>
+                    </a:stretch>
+                  </pic:blipFill>
+                  <pic:spPr>
+                    <a:xfrm>
+                      <a:off x="0" y="0"/>
+                      <a:ext cx="5760720" cy="4402150"/>
+                    </a:xfrm>
+                    <a:prstGeom prst="rect"/>
+                  </pic:spPr>
+                </pic:pic>
+              </a:graphicData>
+            </a:graphic>
+          </wp:inline>
+        </w:drawing>
+      </w:r>
+    </w:p>
+    <w:p>
+      <w:pPr>
+        <w:jc w:val="center"/>
+      </w:pPr>
+      <w:r>
+        <w:rPr>
+          <w:color w:val="64748B"/>
+          <w:sz w:val="17"/>
+        </w:rPr>
+        <w:t>图 4 附件页：分片上传完成后的附件列表</w:t>
+      </w:r>
+    </w:p>
+    <w:p>
+      <w:pPr>
+        <w:pStyle w:val="Heading1"/>
+      </w:pPr>
+      <w:r>
+        <w:t>5. 合同分配与待办</w:t>
+      </w:r>
+    </w:p>
+    <w:p>
+      <w:r>
+        <w:t>合同分配由具备 contract:assign 权限的人员执行。系统会按权限筛选可分配候选人，避免把会签、审批、签订任务派给没有对应权限的用户。</w:t>
+      </w:r>
+    </w:p>
+    <w:p>
+      <w:pPr>
+        <w:pStyle w:val="ListNumber"/>
+      </w:pPr>
+      <w:r>
+        <w:t>在合同详情页点击“分配人员”页签。</w:t>
+      </w:r>
+    </w:p>
+    <w:p>
+      <w:pPr>
+        <w:pStyle w:val="ListNumber"/>
+      </w:pPr>
+      <w:r>
+        <w:t>会签人员支持多选，所有会签任务完成后合同才进入定稿环节。</w:t>
+      </w:r>
+    </w:p>
+    <w:p>
+      <w:pPr>
+        <w:pStyle w:val="ListNumber"/>
+      </w:pPr>
+      <w:r>
+        <w:t>审批人员支持多选，所有审批人通过后才进入签订环节；任一审批人拒绝则合同进入拒绝状态。</w:t>
+      </w:r>
+    </w:p>
+    <w:p>
+      <w:pPr>
+        <w:pStyle w:val="ListNumber"/>
+      </w:pPr>
+      <w:r>
+        <w:t>签订人员为单选，且不能是起草人，避免同一人完成起草和最终签订。</w:t>
+      </w:r>
+    </w:p>
+    <w:p>
+      <w:pPr>
+        <w:pStyle w:val="ListNumber"/>
+      </w:pPr>
+      <w:r>
+        <w:t>点击确认分配后，分配任务变为已完成，系统生成会签待办，并把合同状态推进到已分配。</w:t>
+      </w:r>
+    </w:p>
+    <w:p>
+      <w:pPr>
+        <w:jc w:val="center"/>
+      </w:pPr>
+      <w:r>
+        <w:drawing>
+          <wp:inline xmlns:a="http://schemas.openxmlformats.org/drawingml/2006/main" xmlns:pic="http://schemas.openxmlformats.org/drawingml/2006/picture">
+            <wp:extent cx="5760720" cy="4402150"/>
+            <wp:docPr id="5" name="Picture 5"/>
+            <wp:cNvGraphicFramePr>
+              <a:graphicFrameLocks noChangeAspect="1"/>
+            </wp:cNvGraphicFramePr>
+            <a:graphic>
+              <a:graphicData uri="http://schemas.openxmlformats.org/drawingml/2006/picture">
+                <pic:pic>
+                  <pic:nvPicPr>
+                    <pic:cNvPr id="0" name="05-assign-users.jpg"/>
+                    <pic:cNvPicPr/>
+                  </pic:nvPicPr>
+                  <pic:blipFill>
+                    <a:blip r:embed="rId14"/>
+                    <a:stretch>
+                      <a:fillRect/>
+                    </a:stretch>
+                  </pic:blipFill>
+                  <pic:spPr>
+                    <a:xfrm>
+                      <a:off x="0" y="0"/>
+                      <a:ext cx="5760720" cy="4402150"/>
+                    </a:xfrm>
+                    <a:prstGeom prst="rect"/>
+                  </pic:spPr>
+                </pic:pic>
+              </a:graphicData>
+            </a:graphic>
+          </wp:inline>
+        </w:drawing>
+      </w:r>
+    </w:p>
+    <w:p>
+      <w:pPr>
+        <w:jc w:val="center"/>
+      </w:pPr>
+      <w:r>
+        <w:rPr>
+          <w:color w:val="64748B"/>
+          <w:sz w:val="17"/>
+        </w:rPr>
+        <w:t>图 5 分配人员：会签、审批、签订候选人由权限过滤</w:t>
+      </w:r>
+    </w:p>
+    <w:p>
+      <w:pPr>
+        <w:pStyle w:val="Heading1"/>
+      </w:pPr>
+      <w:r>
+        <w:t>6. 主流程操作</w:t>
+      </w:r>
+    </w:p>
+    <w:tbl>
+      <w:tblPr>
+        <w:tblStyle w:val="TableGrid"/>
+        <w:tblW w:type="auto" w:w="0"/>
+        <w:tblLayout w:type="autofit"/>
+        <w:tblLook w:firstColumn="1" w:firstRow="1" w:lastColumn="0" w:lastRow="0" w:noHBand="0" w:noVBand="1" w:val="04A0"/>
+      </w:tblPr>
+      <w:tblGrid>
+        <w:gridCol w:w="1958"/>
+        <w:gridCol w:w="1958"/>
+        <w:gridCol w:w="1958"/>
+        <w:gridCol w:w="1958"/>
+        <w:gridCol w:w="1958"/>
+      </w:tblGrid>
+      <w:tr>
+        <w:tc>
+          <w:tcPr>
+            <w:tcW w:type="dxa" w:w="1958"/>
+            <w:shd w:fill="F2F4F7"/>
+            <w:vAlign w:val="center"/>
+          </w:tcPr>
+          <w:p>
+            <w:r/>
+            <w:r>
+              <w:rPr>
+                <w:b/>
+                <w:sz w:val="18"/>
+              </w:rPr>
+              <w:t>环节</w:t>
+            </w:r>
+          </w:p>
+        </w:tc>
+        <w:tc>
+          <w:tcPr>
+            <w:tcW w:type="dxa" w:w="1958"/>
+            <w:shd w:fill="F2F4F7"/>
+            <w:vAlign w:val="center"/>
+          </w:tcPr>
+          <w:p>
+            <w:r/>
+            <w:r>
+              <w:rPr>
+                <w:b/>
+                <w:sz w:val="18"/>
+              </w:rPr>
+              <w:t>操作人</w:t>
+            </w:r>
+          </w:p>
+        </w:tc>
+        <w:tc>
+          <w:tcPr>
+            <w:tcW w:type="dxa" w:w="1958"/>
+            <w:shd w:fill="F2F4F7"/>
+            <w:vAlign w:val="center"/>
+          </w:tcPr>
+          <w:p>
+            <w:r/>
+            <w:r>
+              <w:rPr>
+                <w:b/>
+                <w:sz w:val="18"/>
+              </w:rPr>
+              <w:t>入口</w:t>
+            </w:r>
+          </w:p>
+        </w:tc>
+        <w:tc>
+          <w:tcPr>
+            <w:tcW w:type="dxa" w:w="1958"/>
+            <w:shd w:fill="F2F4F7"/>
+            <w:vAlign w:val="center"/>
+          </w:tcPr>
+          <w:p>
+            <w:r/>
+            <w:r>
+              <w:rPr>
+                <w:b/>
+                <w:sz w:val="18"/>
+              </w:rPr>
+              <w:t>完成后状态</w:t>
+            </w:r>
+          </w:p>
+        </w:tc>
+        <w:tc>
+          <w:tcPr>
+            <w:tcW w:type="dxa" w:w="1958"/>
+            <w:shd w:fill="F2F4F7"/>
+            <w:vAlign w:val="center"/>
+          </w:tcPr>
+          <w:p>
+            <w:r/>
+            <w:r>
+              <w:rPr>
+                <w:b/>
+                <w:sz w:val="18"/>
+              </w:rPr>
+              <w:t>可回退动作</w:t>
+            </w:r>
+          </w:p>
+        </w:tc>
+      </w:tr>
+      <w:tr>
+        <w:tc>
+          <w:tcPr>
+            <w:tcW w:type="dxa" w:w="1958"/>
+            <w:vAlign w:val="center"/>
+          </w:tcPr>
+          <w:p>
+            <w:r/>
+            <w:r>
+              <w:rPr>
+                <w:b w:val="0"/>
+                <w:sz w:val="18"/>
+              </w:rPr>
+              <w:t>分配</w:t>
+            </w:r>
+          </w:p>
+        </w:tc>
+        <w:tc>
+          <w:tcPr>
+            <w:tcW w:type="dxa" w:w="1958"/>
+            <w:vAlign w:val="center"/>
+          </w:tcPr>
+          <w:p>
+            <w:r/>
+            <w:r>
+              <w:rPr>
+                <w:b w:val="0"/>
+                <w:sz w:val="18"/>
+              </w:rPr>
+              <w:t>合同管理员</w:t>
+            </w:r>
+          </w:p>
+        </w:tc>
+        <w:tc>
+          <w:tcPr>
+            <w:tcW w:type="dxa" w:w="1958"/>
+            <w:vAlign w:val="center"/>
+          </w:tcPr>
+          <w:p>
+            <w:r/>
+            <w:r>
+              <w:rPr>
+                <w:b w:val="0"/>
+                <w:sz w:val="18"/>
+              </w:rPr>
+              <w:t>合同详情 -&gt; 分配人员</w:t>
+            </w:r>
+          </w:p>
+        </w:tc>
+        <w:tc>
+          <w:tcPr>
+            <w:tcW w:type="dxa" w:w="1958"/>
+            <w:vAlign w:val="center"/>
+          </w:tcPr>
+          <w:p>
+            <w:r/>
+            <w:r>
+              <w:rPr>
+                <w:b w:val="0"/>
+                <w:sz w:val="18"/>
+              </w:rPr>
+              <w:t>ASSIGNED / 已分配</w:t>
+            </w:r>
+          </w:p>
+        </w:tc>
+        <w:tc>
+          <w:tcPr>
+            <w:tcW w:type="dxa" w:w="1958"/>
+            <w:vAlign w:val="center"/>
+          </w:tcPr>
+          <w:p>
+            <w:r/>
+            <w:r>
+              <w:rPr>
+                <w:b w:val="0"/>
+                <w:sz w:val="18"/>
+              </w:rPr>
+              <w:t>起草人可撤回合同</w:t>
+            </w:r>
+          </w:p>
+        </w:tc>
+      </w:tr>
+      <w:tr>
+        <w:tc>
+          <w:tcPr>
+            <w:tcW w:type="dxa" w:w="1958"/>
+            <w:vAlign w:val="center"/>
+          </w:tcPr>
+          <w:p>
+            <w:r/>
+            <w:r>
+              <w:rPr>
+                <w:b w:val="0"/>
+                <w:sz w:val="18"/>
+              </w:rPr>
+              <w:t>会签</w:t>
+            </w:r>
+          </w:p>
+        </w:tc>
+        <w:tc>
+          <w:tcPr>
+            <w:tcW w:type="dxa" w:w="1958"/>
+            <w:vAlign w:val="center"/>
+          </w:tcPr>
+          <w:p>
+            <w:r/>
+            <w:r>
+              <w:rPr>
+                <w:b w:val="0"/>
+                <w:sz w:val="18"/>
+              </w:rPr>
+              <w:t>会签人</w:t>
+            </w:r>
+          </w:p>
+        </w:tc>
+        <w:tc>
+          <w:tcPr>
+            <w:tcW w:type="dxa" w:w="1958"/>
+            <w:vAlign w:val="center"/>
+          </w:tcPr>
+          <w:p>
+            <w:r/>
+            <w:r>
+              <w:rPr>
+                <w:b w:val="0"/>
+                <w:sz w:val="18"/>
+              </w:rPr>
+              <w:t>我的待办 -&gt; 当前处理</w:t>
+            </w:r>
+          </w:p>
+        </w:tc>
+        <w:tc>
+          <w:tcPr>
+            <w:tcW w:type="dxa" w:w="1958"/>
+            <w:vAlign w:val="center"/>
+          </w:tcPr>
+          <w:p>
+            <w:r/>
+            <w:r>
+              <w:rPr>
+                <w:b w:val="0"/>
+                <w:sz w:val="18"/>
+              </w:rPr>
+              <w:t>COUNTERSIGNED / 已会签</w:t>
+            </w:r>
+          </w:p>
+        </w:tc>
+        <w:tc>
+          <w:tcPr>
+            <w:tcW w:type="dxa" w:w="1958"/>
+            <w:vAlign w:val="center"/>
+          </w:tcPr>
+          <w:p>
+            <w:r/>
+            <w:r>
+              <w:rPr>
+                <w:b w:val="0"/>
+                <w:sz w:val="18"/>
+              </w:rPr>
+              <w:t>会签人可打回到重新起草</w:t>
+            </w:r>
+          </w:p>
+        </w:tc>
+      </w:tr>
+      <w:tr>
+        <w:tc>
+          <w:tcPr>
+            <w:tcW w:type="dxa" w:w="1958"/>
+            <w:vAlign w:val="center"/>
+          </w:tcPr>
+          <w:p>
+            <w:r/>
+            <w:r>
+              <w:rPr>
+                <w:b w:val="0"/>
+                <w:sz w:val="18"/>
+              </w:rPr>
+              <w:t>定稿</w:t>
+            </w:r>
+          </w:p>
+        </w:tc>
+        <w:tc>
+          <w:tcPr>
+            <w:tcW w:type="dxa" w:w="1958"/>
+            <w:vAlign w:val="center"/>
+          </w:tcPr>
+          <w:p>
+            <w:r/>
+            <w:r>
+              <w:rPr>
+                <w:b w:val="0"/>
+                <w:sz w:val="18"/>
+              </w:rPr>
+              <w:t>起草人</w:t>
+            </w:r>
+          </w:p>
+        </w:tc>
+        <w:tc>
+          <w:tcPr>
+            <w:tcW w:type="dxa" w:w="1958"/>
+            <w:vAlign w:val="center"/>
+          </w:tcPr>
+          <w:p>
+            <w:r/>
+            <w:r>
+              <w:rPr>
+                <w:b w:val="0"/>
+                <w:sz w:val="18"/>
+              </w:rPr>
+              <w:t>我的待办或合同详情 -&gt; 当前处理</w:t>
+            </w:r>
+          </w:p>
+        </w:tc>
+        <w:tc>
+          <w:tcPr>
+            <w:tcW w:type="dxa" w:w="1958"/>
+            <w:vAlign w:val="center"/>
+          </w:tcPr>
+          <w:p>
+            <w:r/>
+            <w:r>
+              <w:rPr>
+                <w:b w:val="0"/>
+                <w:sz w:val="18"/>
+              </w:rPr>
+              <w:t>FINALIZED / 已定稿</w:t>
+            </w:r>
+          </w:p>
+        </w:tc>
+        <w:tc>
+          <w:tcPr>
+            <w:tcW w:type="dxa" w:w="1958"/>
+            <w:vAlign w:val="center"/>
+          </w:tcPr>
+          <w:p>
+            <w:r/>
+            <w:r>
+              <w:rPr>
+                <w:b w:val="0"/>
+                <w:sz w:val="18"/>
+              </w:rPr>
+              <w:t>起草人可在后续未完成前撤回任务</w:t>
+            </w:r>
+          </w:p>
+        </w:tc>
+      </w:tr>
+      <w:tr>
+        <w:tc>
+          <w:tcPr>
+            <w:tcW w:type="dxa" w:w="1958"/>
+            <w:vAlign w:val="center"/>
+          </w:tcPr>
+          <w:p>
+            <w:r/>
+            <w:r>
+              <w:rPr>
+                <w:b w:val="0"/>
+                <w:sz w:val="18"/>
+              </w:rPr>
+              <w:t>审批</w:t>
+            </w:r>
+          </w:p>
+        </w:tc>
+        <w:tc>
+          <w:tcPr>
+            <w:tcW w:type="dxa" w:w="1958"/>
+            <w:vAlign w:val="center"/>
+          </w:tcPr>
+          <w:p>
+            <w:r/>
+            <w:r>
+              <w:rPr>
+                <w:b w:val="0"/>
+                <w:sz w:val="18"/>
+              </w:rPr>
+              <w:t>审批人</w:t>
+            </w:r>
+          </w:p>
+        </w:tc>
+        <w:tc>
+          <w:tcPr>
+            <w:tcW w:type="dxa" w:w="1958"/>
+            <w:vAlign w:val="center"/>
+          </w:tcPr>
+          <w:p>
+            <w:r/>
+            <w:r>
+              <w:rPr>
+                <w:b w:val="0"/>
+                <w:sz w:val="18"/>
+              </w:rPr>
+              <w:t>我的待办 -&gt; 当前处理</w:t>
+            </w:r>
+          </w:p>
+        </w:tc>
+        <w:tc>
+          <w:tcPr>
+            <w:tcW w:type="dxa" w:w="1958"/>
+            <w:vAlign w:val="center"/>
+          </w:tcPr>
+          <w:p>
+            <w:r/>
+            <w:r>
+              <w:rPr>
+                <w:b w:val="0"/>
+                <w:sz w:val="18"/>
+              </w:rPr>
+              <w:t>APPROVED / 已审批 或 RETURNED / 已打回</w:t>
+            </w:r>
+          </w:p>
+        </w:tc>
+        <w:tc>
+          <w:tcPr>
+            <w:tcW w:type="dxa" w:w="1958"/>
+            <w:vAlign w:val="center"/>
+          </w:tcPr>
+          <w:p>
+            <w:r/>
+            <w:r>
+              <w:rPr>
+                <w:b w:val="0"/>
+                <w:sz w:val="18"/>
+              </w:rPr>
+              <w:t>审批人可打回到重新定稿或重新起草</w:t>
+            </w:r>
+          </w:p>
+        </w:tc>
+      </w:tr>
+      <w:tr>
+        <w:tc>
+          <w:tcPr>
+            <w:tcW w:type="dxa" w:w="1958"/>
+            <w:vAlign w:val="center"/>
+          </w:tcPr>
+          <w:p>
+            <w:r/>
+            <w:r>
+              <w:rPr>
+                <w:b w:val="0"/>
+                <w:sz w:val="18"/>
+              </w:rPr>
+              <w:t>签订</w:t>
+            </w:r>
+          </w:p>
+        </w:tc>
+        <w:tc>
+          <w:tcPr>
+            <w:tcW w:type="dxa" w:w="1958"/>
+            <w:vAlign w:val="center"/>
+          </w:tcPr>
+          <w:p>
+            <w:r/>
+            <w:r>
+              <w:rPr>
+                <w:b w:val="0"/>
+                <w:sz w:val="18"/>
+              </w:rPr>
+              <w:t>签订人</w:t>
+            </w:r>
+          </w:p>
+        </w:tc>
+        <w:tc>
+          <w:tcPr>
+            <w:tcW w:type="dxa" w:w="1958"/>
+            <w:vAlign w:val="center"/>
+          </w:tcPr>
+          <w:p>
+            <w:r/>
+            <w:r>
+              <w:rPr>
+                <w:b w:val="0"/>
+                <w:sz w:val="18"/>
+              </w:rPr>
+              <w:t>我的待办 -&gt; 当前处理</w:t>
+            </w:r>
+          </w:p>
+        </w:tc>
+        <w:tc>
+          <w:tcPr>
+            <w:tcW w:type="dxa" w:w="1958"/>
+            <w:vAlign w:val="center"/>
+          </w:tcPr>
+          <w:p>
+            <w:r/>
+            <w:r>
+              <w:rPr>
+                <w:b w:val="0"/>
+                <w:sz w:val="18"/>
+              </w:rPr>
+              <w:t>SIGNED / 已签订</w:t>
+            </w:r>
+          </w:p>
+        </w:tc>
+        <w:tc>
+          <w:tcPr>
+            <w:tcW w:type="dxa" w:w="1958"/>
+            <w:vAlign w:val="center"/>
+          </w:tcPr>
+          <w:p>
+            <w:r/>
+            <w:r>
+              <w:rPr>
+                <w:b w:val="0"/>
+                <w:sz w:val="18"/>
+              </w:rPr>
+              <w:t>签订前可打回，签订后流程结束</w:t>
+            </w:r>
+          </w:p>
+        </w:tc>
+      </w:tr>
+    </w:tbl>
+    <w:p/>
+    <w:p>
+      <w:pPr>
+        <w:jc w:val="center"/>
+      </w:pPr>
+      <w:r>
+        <w:drawing>
+          <wp:inline xmlns:a="http://schemas.openxmlformats.org/drawingml/2006/main" xmlns:pic="http://schemas.openxmlformats.org/drawingml/2006/picture">
+            <wp:extent cx="5760720" cy="4402150"/>
+            <wp:docPr id="6" name="Picture 6"/>
+            <wp:cNvGraphicFramePr>
+              <a:graphicFrameLocks noChangeAspect="1"/>
+            </wp:cNvGraphicFramePr>
+            <a:graphic>
+              <a:graphicData uri="http://schemas.openxmlformats.org/drawingml/2006/picture">
+                <pic:pic>
+                  <pic:nvPicPr>
+                    <pic:cNvPr id="0" name="06-rollback-round1-assigned.jpg"/>
+                    <pic:cNvPicPr/>
+                  </pic:nvPicPr>
+                  <pic:blipFill>
+                    <a:blip r:embed="rId15"/>
+                    <a:stretch>
+                      <a:fillRect/>
+                    </a:stretch>
+                  </pic:blipFill>
+                  <pic:spPr>
+                    <a:xfrm>
+                      <a:off x="0" y="0"/>
+                      <a:ext cx="5760720" cy="4402150"/>
+                    </a:xfrm>
+                    <a:prstGeom prst="rect"/>
+                  </pic:spPr>
+                </pic:pic>
+              </a:graphicData>
+            </a:graphic>
+          </wp:inline>
+        </w:drawing>
+      </w:r>
+    </w:p>
+    <w:p>
+      <w:pPr>
+        <w:jc w:val="center"/>
+      </w:pPr>
+      <w:r>
+        <w:rPr>
+          <w:color w:val="64748B"/>
+          <w:sz w:val="17"/>
+        </w:rPr>
+        <w:t>图 6 回退模型初始状态：第 1 轮已分配，后续任务等待处理</w:t>
+      </w:r>
+    </w:p>
+    <w:p>
+      <w:pPr>
+        <w:jc w:val="center"/>
+      </w:pPr>
+      <w:r>
+        <w:drawing>
+          <wp:inline xmlns:a="http://schemas.openxmlformats.org/drawingml/2006/main" xmlns:pic="http://schemas.openxmlformats.org/drawingml/2006/picture">
+            <wp:extent cx="5760720" cy="4402150"/>
+            <wp:docPr id="7" name="Picture 7"/>
+            <wp:cNvGraphicFramePr>
+              <a:graphicFrameLocks noChangeAspect="1"/>
+            </wp:cNvGraphicFramePr>
+            <a:graphic>
+              <a:graphicData uri="http://schemas.openxmlformats.org/drawingml/2006/picture">
+                <pic:pic>
+                  <pic:nvPicPr>
+                    <pic:cNvPr id="0" name="07-approval-action-return.jpg"/>
+                    <pic:cNvPicPr/>
+                  </pic:nvPicPr>
+                  <pic:blipFill>
+                    <a:blip r:embed="rId16"/>
+                    <a:stretch>
+                      <a:fillRect/>
+                    </a:stretch>
+                  </pic:blipFill>
+                  <pic:spPr>
+                    <a:xfrm>
+                      <a:off x="0" y="0"/>
+                      <a:ext cx="5760720" cy="4402150"/>
+                    </a:xfrm>
+                    <a:prstGeom prst="rect"/>
+                  </pic:spPr>
+                </pic:pic>
+              </a:graphicData>
+            </a:graphic>
+          </wp:inline>
+        </w:drawing>
+      </w:r>
+    </w:p>
+    <w:p>
+      <w:pPr>
+        <w:jc w:val="center"/>
+      </w:pPr>
+      <w:r>
+        <w:rPr>
+          <w:color w:val="64748B"/>
+          <w:sz w:val="17"/>
+        </w:rPr>
+        <w:t>图 7 审批处理页：审批人可选择通过、拒绝或打回</w:t>
+      </w:r>
+    </w:p>
+    <w:p>
+      <w:pPr>
+        <w:pStyle w:val="Heading1"/>
+      </w:pPr>
+      <w:r>
+        <w:t>7. 回退模型完整演示</w:t>
+      </w:r>
+    </w:p>
+    <w:p>
+      <w:r>
+        <w:t>回退模型是本系统结题答辩的核心演示点。它解决的问题是：合同不是简单单向流转，实际业务中审批或签订环节经常要求补充材料、重新定稿或重新起草。系统通过 currentRound、returnTargetStage、ContractTask.round 和 SUPERSEDED 状态保留每一轮任务历史，并为恢复后的新轮次生成新的当前任务。</w:t>
+      </w:r>
+    </w:p>
+    <w:p>
+      <w:pPr>
+        <w:pStyle w:val="Heading2"/>
+      </w:pPr>
+      <w:r>
+        <w:t>7.1 审批打回到重新定稿</w:t>
+      </w:r>
+    </w:p>
+    <w:p>
+      <w:pPr>
+        <w:pStyle w:val="ListNumber"/>
+      </w:pPr>
+      <w:r>
+        <w:t>先完成分配、会签和第一轮定稿，使合同进入“已定稿”。</w:t>
+      </w:r>
+    </w:p>
+    <w:p>
+      <w:pPr>
+        <w:pStyle w:val="ListNumber"/>
+      </w:pPr>
+      <w:r>
+        <w:t>审批人打开“当前处理”，在打回目标中选择“重新定稿”，填写打回原因。</w:t>
+      </w:r>
+    </w:p>
+    <w:p>
+      <w:pPr>
+        <w:pStyle w:val="ListNumber"/>
+      </w:pPr>
+      <w:r>
+        <w:t>提交后合同状态变为“已打回”，回退目标显示“重新定稿”，起草人收到处理打回合同的待办。</w:t>
+      </w:r>
+    </w:p>
+    <w:p>
+      <w:pPr>
+        <w:pStyle w:val="ListNumber"/>
+      </w:pPr>
+      <w:r>
+        <w:t>回退模型页仍显示第 1 轮任务：分配、会签、定稿、审批均保留处理人、状态、意见和时间。</w:t>
+      </w:r>
+    </w:p>
+    <w:p>
+      <w:pPr>
+        <w:jc w:val="center"/>
+      </w:pPr>
+      <w:r>
+        <w:drawing>
+          <wp:inline xmlns:a="http://schemas.openxmlformats.org/drawingml/2006/main" xmlns:pic="http://schemas.openxmlformats.org/drawingml/2006/picture">
+            <wp:extent cx="5760720" cy="4402150"/>
+            <wp:docPr id="8" name="Picture 8"/>
+            <wp:cNvGraphicFramePr>
+              <a:graphicFrameLocks noChangeAspect="1"/>
+            </wp:cNvGraphicFramePr>
+            <a:graphic>
+              <a:graphicData uri="http://schemas.openxmlformats.org/drawingml/2006/picture">
+                <pic:pic>
+                  <pic:nvPicPr>
+                    <pic:cNvPr id="0" name="08-returned-to-finalize.jpg"/>
+                    <pic:cNvPicPr/>
+                  </pic:nvPicPr>
+                  <pic:blipFill>
+                    <a:blip r:embed="rId17"/>
+                    <a:stretch>
+                      <a:fillRect/>
+                    </a:stretch>
+                  </pic:blipFill>
+                  <pic:spPr>
+                    <a:xfrm>
+                      <a:off x="0" y="0"/>
+                      <a:ext cx="5760720" cy="4402150"/>
+                    </a:xfrm>
+                    <a:prstGeom prst="rect"/>
+                  </pic:spPr>
+                </pic:pic>
+              </a:graphicData>
+            </a:graphic>
+          </wp:inline>
+        </w:drawing>
+      </w:r>
+    </w:p>
+    <w:p>
+      <w:pPr>
+        <w:jc w:val="center"/>
+      </w:pPr>
+      <w:r>
+        <w:rPr>
+          <w:color w:val="64748B"/>
+          <w:sz w:val="17"/>
+        </w:rPr>
+        <w:t>图 8 已打回：回退目标为重新定稿，审批意见作为打回原因保留</w:t>
+      </w:r>
+    </w:p>
+    <w:p>
+      <w:pPr>
+        <w:pStyle w:val="Heading2"/>
+      </w:pPr>
+      <w:r>
+        <w:t>7.2 起草人恢复流程并进入第 2 轮</w:t>
+      </w:r>
+    </w:p>
+    <w:p>
+      <w:pPr>
+        <w:pStyle w:val="ListNumber"/>
+      </w:pPr>
+      <w:r>
+        <w:t>起草人查看打回原因，进入编辑合同或当前处理页补充合同内容。</w:t>
+      </w:r>
+    </w:p>
+    <w:p>
+      <w:pPr>
+        <w:pStyle w:val="ListNumber"/>
+      </w:pPr>
+      <w:r>
+        <w:t>点击“恢复流程”后，系统读取 returnTargetStage；若目标为 FINALIZE，则进入第 2 轮定稿流程。</w:t>
+      </w:r>
+    </w:p>
+    <w:p>
+      <w:pPr>
+        <w:pStyle w:val="ListNumber"/>
+      </w:pPr>
+      <w:r>
+        <w:t>第 1 轮任务不被覆盖，新的第 2 轮任务成为当前轮。页面会用“当前轮/历史轮”区分。</w:t>
+      </w:r>
+    </w:p>
+    <w:p>
+      <w:pPr>
+        <w:pStyle w:val="ListNumber"/>
+      </w:pPr>
+      <w:r>
+        <w:t>恢复后保留原会签、审批、签订人员，减少重新分配成本，同时避免旧轮待办误操作。</w:t>
+      </w:r>
+    </w:p>
+    <w:p>
+      <w:pPr>
+        <w:jc w:val="center"/>
+      </w:pPr>
+      <w:r>
+        <w:drawing>
+          <wp:inline xmlns:a="http://schemas.openxmlformats.org/drawingml/2006/main" xmlns:pic="http://schemas.openxmlformats.org/drawingml/2006/picture">
+            <wp:extent cx="5760720" cy="4402150"/>
+            <wp:docPr id="9" name="Picture 9"/>
+            <wp:cNvGraphicFramePr>
+              <a:graphicFrameLocks noChangeAspect="1"/>
+            </wp:cNvGraphicFramePr>
+            <a:graphic>
+              <a:graphicData uri="http://schemas.openxmlformats.org/drawingml/2006/picture">
+                <pic:pic>
+                  <pic:nvPicPr>
+                    <pic:cNvPr id="0" name="09-resumed-round2.jpg"/>
+                    <pic:cNvPicPr/>
+                  </pic:nvPicPr>
+                  <pic:blipFill>
+                    <a:blip r:embed="rId18"/>
+                    <a:stretch>
+                      <a:fillRect/>
+                    </a:stretch>
+                  </pic:blipFill>
+                  <pic:spPr>
+                    <a:xfrm>
+                      <a:off x="0" y="0"/>
+                      <a:ext cx="5760720" cy="4402150"/>
+                    </a:xfrm>
+                    <a:prstGeom prst="rect"/>
+                  </pic:spPr>
+                </pic:pic>
+              </a:graphicData>
+            </a:graphic>
+          </wp:inline>
+        </w:drawing>
+      </w:r>
+    </w:p>
+    <w:p>
+      <w:pPr>
+        <w:jc w:val="center"/>
+      </w:pPr>
+      <w:r>
+        <w:rPr>
+          <w:color w:val="64748B"/>
+          <w:sz w:val="17"/>
+        </w:rPr>
+        <w:t>图 9 恢复流程：currentRound 递增到第 2 轮，并展示当前轮任务</w:t>
+      </w:r>
+    </w:p>
+    <w:p>
+      <w:pPr>
+        <w:pStyle w:val="Heading2"/>
+      </w:pPr>
+      <w:r>
+        <w:t>7.3 第 2 轮通过并签订</w:t>
+      </w:r>
+    </w:p>
+    <w:p>
+      <w:pPr>
+        <w:pStyle w:val="ListNumber"/>
+      </w:pPr>
+      <w:r>
+        <w:t>起草人提交第二轮定稿，系统记录新版本。</w:t>
+      </w:r>
+    </w:p>
+    <w:p>
+      <w:pPr>
+        <w:pStyle w:val="ListNumber"/>
+      </w:pPr>
+      <w:r>
+        <w:t>审批人审批通过后，签订人提交签订日期和签订说明。</w:t>
+      </w:r>
+    </w:p>
+    <w:p>
+      <w:pPr>
+        <w:pStyle w:val="ListNumber"/>
+      </w:pPr>
+      <w:r>
+        <w:t>签订完成后合同状态变为“已签订”，主流程结束，页面仍可查看第 2 轮当前轮和第 1 轮历史轮。</w:t>
+      </w:r>
+    </w:p>
+    <w:p>
+      <w:pPr>
+        <w:pStyle w:val="ListNumber"/>
+      </w:pPr>
+      <w:r>
+        <w:t>验收时重点确认：历史轮没有丢失，当前轮状态完整，保留分配人员清晰展示，回退目标在完成后清空。</w:t>
+      </w:r>
+    </w:p>
+    <w:p>
+      <w:pPr>
+        <w:jc w:val="center"/>
+      </w:pPr>
+      <w:r>
+        <w:drawing>
+          <wp:inline xmlns:a="http://schemas.openxmlformats.org/drawingml/2006/main" xmlns:pic="http://schemas.openxmlformats.org/drawingml/2006/picture">
+            <wp:extent cx="5760720" cy="4402150"/>
+            <wp:docPr id="10" name="Picture 10"/>
+            <wp:cNvGraphicFramePr>
+              <a:graphicFrameLocks noChangeAspect="1"/>
+            </wp:cNvGraphicFramePr>
+            <a:graphic>
+              <a:graphicData uri="http://schemas.openxmlformats.org/drawingml/2006/picture">
+                <pic:pic>
+                  <pic:nvPicPr>
+                    <pic:cNvPr id="0" name="10-signed-round2-complete.jpg"/>
+                    <pic:cNvPicPr/>
+                  </pic:nvPicPr>
+                  <pic:blipFill>
+                    <a:blip r:embed="rId19"/>
+                    <a:stretch>
+                      <a:fillRect/>
+                    </a:stretch>
+                  </pic:blipFill>
+                  <pic:spPr>
+                    <a:xfrm>
+                      <a:off x="0" y="0"/>
+                      <a:ext cx="5760720" cy="4402150"/>
+                    </a:xfrm>
+                    <a:prstGeom prst="rect"/>
+                  </pic:spPr>
+                </pic:pic>
+              </a:graphicData>
+            </a:graphic>
+          </wp:inline>
+        </w:drawing>
+      </w:r>
+    </w:p>
+    <w:p>
+      <w:pPr>
+        <w:jc w:val="center"/>
+      </w:pPr>
+      <w:r>
+        <w:rPr>
+          <w:color w:val="64748B"/>
+          <w:sz w:val="17"/>
+        </w:rPr>
+        <w:t>图 10 签订完成：第 2 轮完成，同时保留第 1 轮历史</w:t>
+      </w:r>
+    </w:p>
+    <w:p>
+      <w:pPr>
+        <w:pStyle w:val="Heading1"/>
+      </w:pPr>
+      <w:r>
+        <w:t>8. 时间线与版本历史</w:t>
+      </w:r>
+    </w:p>
+    <w:p>
+      <w:r>
+        <w:t>时间线和版本历史用于回答“合同为什么变成现在这个状态”和“每次修改了什么”。</w:t>
+      </w:r>
+    </w:p>
+    <w:p>
+      <w:pPr>
+        <w:pStyle w:val="ListNumber"/>
+      </w:pPr>
+      <w:r>
+        <w:t>进入“流程时间线”页签，按时间顺序查看状态从起草、分配、会签、定稿、打回、恢复、审批到签订的变化。</w:t>
+      </w:r>
+    </w:p>
+    <w:p>
+      <w:pPr>
+        <w:pStyle w:val="ListNumber"/>
+      </w:pPr>
+      <w:r>
+        <w:t>每条时间线记录包含起止状态、操作人、时间和备注，可用于答辩展示流程闭环。</w:t>
+      </w:r>
+    </w:p>
+    <w:p>
+      <w:pPr>
+        <w:pStyle w:val="ListNumber"/>
+      </w:pPr>
+      <w:r>
+        <w:t>进入“版本历史”页签，查看起草、修改、定稿等动作产生的版本记录。</w:t>
+      </w:r>
+    </w:p>
+    <w:p>
+      <w:pPr>
+        <w:pStyle w:val="ListNumber"/>
+      </w:pPr>
+      <w:r>
+        <w:t>版本历史不会替代附件，只记录合同核心字段和正文内容变化；附件变化在附件列表和操作日志中追踪。</w:t>
+      </w:r>
+    </w:p>
+    <w:p>
+      <w:pPr>
+        <w:jc w:val="center"/>
+      </w:pPr>
+      <w:r>
+        <w:drawing>
+          <wp:inline xmlns:a="http://schemas.openxmlformats.org/drawingml/2006/main" xmlns:pic="http://schemas.openxmlformats.org/drawingml/2006/picture">
+            <wp:extent cx="5760720" cy="4402150"/>
+            <wp:docPr id="11" name="Picture 11"/>
+            <wp:cNvGraphicFramePr>
+              <a:graphicFrameLocks noChangeAspect="1"/>
+            </wp:cNvGraphicFramePr>
+            <a:graphic>
+              <a:graphicData uri="http://schemas.openxmlformats.org/drawingml/2006/picture">
+                <pic:pic>
+                  <pic:nvPicPr>
+                    <pic:cNvPr id="0" name="11-contract-timeline.jpg"/>
+                    <pic:cNvPicPr/>
+                  </pic:nvPicPr>
+                  <pic:blipFill>
+                    <a:blip r:embed="rId20"/>
+                    <a:stretch>
+                      <a:fillRect/>
+                    </a:stretch>
+                  </pic:blipFill>
+                  <pic:spPr>
+                    <a:xfrm>
+                      <a:off x="0" y="0"/>
+                      <a:ext cx="5760720" cy="4402150"/>
+                    </a:xfrm>
+                    <a:prstGeom prst="rect"/>
+                  </pic:spPr>
+                </pic:pic>
+              </a:graphicData>
+            </a:graphic>
+          </wp:inline>
+        </w:drawing>
+      </w:r>
+    </w:p>
+    <w:p>
+      <w:pPr>
+        <w:jc w:val="center"/>
+      </w:pPr>
+      <w:r>
+        <w:rPr>
+          <w:color w:val="64748B"/>
+          <w:sz w:val="17"/>
+        </w:rPr>
+        <w:t>图 11 流程时间线：状态变化和备注可追溯</w:t>
+      </w:r>
+    </w:p>
+    <w:p>
+      <w:pPr>
+        <w:jc w:val="center"/>
+      </w:pPr>
+      <w:r>
+        <w:drawing>
+          <wp:inline xmlns:a="http://schemas.openxmlformats.org/drawingml/2006/main" xmlns:pic="http://schemas.openxmlformats.org/drawingml/2006/picture">
+            <wp:extent cx="5760720" cy="4402150"/>
+            <wp:docPr id="12" name="Picture 12"/>
+            <wp:cNvGraphicFramePr>
+              <a:graphicFrameLocks noChangeAspect="1"/>
+            </wp:cNvGraphicFramePr>
+            <a:graphic>
+              <a:graphicData uri="http://schemas.openxmlformats.org/drawingml/2006/picture">
+                <pic:pic>
+                  <pic:nvPicPr>
+                    <pic:cNvPr id="0" name="11-contract-timeline.jpg"/>
+                    <pic:cNvPicPr/>
+                  </pic:nvPicPr>
+                  <pic:blipFill>
+                    <a:blip r:embed="rId20"/>
+                    <a:stretch>
+                      <a:fillRect/>
+                    </a:stretch>
+                  </pic:blipFill>
+                  <pic:spPr>
+                    <a:xfrm>
+                      <a:off x="0" y="0"/>
+                      <a:ext cx="5760720" cy="4402150"/>
+                    </a:xfrm>
+                    <a:prstGeom prst="rect"/>
+                  </pic:spPr>
+                </pic:pic>
+              </a:graphicData>
+            </a:graphic>
+          </wp:inline>
+        </w:drawing>
+      </w:r>
+    </w:p>
+    <w:p>
+      <w:pPr>
+        <w:jc w:val="center"/>
+      </w:pPr>
+      <w:r>
+        <w:rPr>
+          <w:color w:val="64748B"/>
+          <w:sz w:val="17"/>
+        </w:rPr>
+        <w:t>图 12 版本历史：起草、定稿和修改形成版本链</w:t>
+      </w:r>
+    </w:p>
+    <w:p>
+      <w:pPr>
+        <w:pStyle w:val="Heading1"/>
+      </w:pPr>
+      <w:r>
+        <w:t>9. 查询、统计与导出</w:t>
+      </w:r>
+    </w:p>
+    <w:p>
+      <w:r>
+        <w:t>查询统计面向管理员、档案人员和答辩演示。它把原作业文档中“按合同编号和名称查询”扩展为多条件检索、状态统计、月度统计和 CSV 导出。</w:t>
+      </w:r>
+    </w:p>
+    <w:p>
+      <w:pPr>
+        <w:pStyle w:val="ListNumber"/>
+      </w:pPr>
+      <w:r>
+        <w:t>进入“合同查询”，可按合同编号/名称、状态、客户、开始日期范围、结束日期范围组合筛选。</w:t>
+      </w:r>
+    </w:p>
+    <w:p>
+      <w:pPr>
+        <w:pStyle w:val="ListNumber"/>
+      </w:pPr>
+      <w:r>
+        <w:t>点击“导出”下载 CSV。导出服务会对逗号、换行、引号和 Excel 公式前缀做转义，降低审计导出风险。</w:t>
+      </w:r>
+    </w:p>
+    <w:p>
+      <w:pPr>
+        <w:pStyle w:val="ListNumber"/>
+      </w:pPr>
+      <w:r>
+        <w:t>工作台的状态分布和月度合同量来自统计接口，合同发生变更后通过事件监听使缓存失效。</w:t>
+      </w:r>
+    </w:p>
+    <w:p>
+      <w:pPr>
+        <w:pStyle w:val="ListNumber"/>
+      </w:pPr>
+      <w:r>
+        <w:t>状态卡片可作为快速入口：点击某个状态后跳转到对应状态的合同列表。</w:t>
+      </w:r>
+    </w:p>
+    <w:p>
+      <w:pPr>
+        <w:jc w:val="center"/>
+      </w:pPr>
+      <w:r>
+        <w:drawing>
+          <wp:inline xmlns:a="http://schemas.openxmlformats.org/drawingml/2006/main" xmlns:pic="http://schemas.openxmlformats.org/drawingml/2006/picture">
+            <wp:extent cx="5760720" cy="4402150"/>
+            <wp:docPr id="13" name="Picture 13"/>
+            <wp:cNvGraphicFramePr>
+              <a:graphicFrameLocks noChangeAspect="1"/>
+            </wp:cNvGraphicFramePr>
+            <a:graphic>
+              <a:graphicData uri="http://schemas.openxmlformats.org/drawingml/2006/picture">
+                <pic:pic>
+                  <pic:nvPicPr>
+                    <pic:cNvPr id="0" name="13-contract-query-export.jpg"/>
+                    <pic:cNvPicPr/>
+                  </pic:nvPicPr>
+                  <pic:blipFill>
+                    <a:blip r:embed="rId21"/>
+                    <a:stretch>
+                      <a:fillRect/>
+                    </a:stretch>
+                  </pic:blipFill>
+                  <pic:spPr>
+                    <a:xfrm>
+                      <a:off x="0" y="0"/>
+                      <a:ext cx="5760720" cy="4402150"/>
+                    </a:xfrm>
+                    <a:prstGeom prst="rect"/>
+                  </pic:spPr>
+                </pic:pic>
+              </a:graphicData>
+            </a:graphic>
+          </wp:inline>
+        </w:drawing>
+      </w:r>
+    </w:p>
+    <w:p>
+      <w:pPr>
+        <w:jc w:val="center"/>
+      </w:pPr>
+      <w:r>
+        <w:rPr>
+          <w:color w:val="64748B"/>
+          <w:sz w:val="17"/>
+        </w:rPr>
+        <w:t>图 13 合同查询：多条件检索和 CSV 导出</w:t>
+      </w:r>
+    </w:p>
+    <w:p>
+      <w:pPr>
+        <w:pStyle w:val="Heading1"/>
+      </w:pPr>
+      <w:r>
+        <w:t>10. 操作日志与审计</w:t>
+      </w:r>
+    </w:p>
+    <w:p>
+      <w:r>
+        <w:t>操作日志记录用户、模块、动作、对象和内容，是结题答辩中证明“可追踪性”的功能。合同状态变化会以状态标签形式展示，便于定位关键操作。</w:t>
+      </w:r>
+    </w:p>
+    <w:p>
+      <w:pPr>
+        <w:pStyle w:val="ListNumber"/>
+      </w:pPr>
+      <w:r>
+        <w:t>管理员进入“系统管理 -&gt; 操作日志”。</w:t>
+      </w:r>
+    </w:p>
+    <w:p>
+      <w:pPr>
+        <w:pStyle w:val="ListNumber"/>
+      </w:pPr>
+      <w:r>
+        <w:t>可按关键字、模块和时间范围筛选，例如只看 CONTRACT 模块或某个操作人。</w:t>
+      </w:r>
+    </w:p>
+    <w:p>
+      <w:pPr>
+        <w:pStyle w:val="ListNumber"/>
+      </w:pPr>
+      <w:r>
+        <w:t>点击“导出 CSV”得到日志备份文件，用于归档或验收。</w:t>
+      </w:r>
+    </w:p>
+    <w:p>
+      <w:pPr>
+        <w:pStyle w:val="ListNumber"/>
+      </w:pPr>
+      <w:r>
+        <w:t>日志由领域事件异步解耦记录，业务服务只发布操作事件，日志监听器负责落库。</w:t>
+      </w:r>
+    </w:p>
+    <w:p>
+      <w:pPr>
+        <w:jc w:val="center"/>
+      </w:pPr>
+      <w:r>
+        <w:drawing>
+          <wp:inline xmlns:a="http://schemas.openxmlformats.org/drawingml/2006/main" xmlns:pic="http://schemas.openxmlformats.org/drawingml/2006/picture">
+            <wp:extent cx="5760720" cy="4402150"/>
+            <wp:docPr id="14" name="Picture 14"/>
+            <wp:cNvGraphicFramePr>
+              <a:graphicFrameLocks noChangeAspect="1"/>
+            </wp:cNvGraphicFramePr>
+            <a:graphic>
+              <a:graphicData uri="http://schemas.openxmlformats.org/drawingml/2006/picture">
+                <pic:pic>
+                  <pic:nvPicPr>
+                    <pic:cNvPr id="0" name="14-operation-logs.jpg"/>
+                    <pic:cNvPicPr/>
+                  </pic:nvPicPr>
+                  <pic:blipFill>
+                    <a:blip r:embed="rId22"/>
+                    <a:stretch>
+                      <a:fillRect/>
+                    </a:stretch>
+                  </pic:blipFill>
+                  <pic:spPr>
+                    <a:xfrm>
+                      <a:off x="0" y="0"/>
+                      <a:ext cx="5760720" cy="4402150"/>
+                    </a:xfrm>
+                    <a:prstGeom prst="rect"/>
+                  </pic:spPr>
+                </pic:pic>
+              </a:graphicData>
+            </a:graphic>
+          </wp:inline>
+        </w:drawing>
+      </w:r>
+    </w:p>
+    <w:p>
+      <w:pPr>
+        <w:jc w:val="center"/>
+      </w:pPr>
+      <w:r>
+        <w:rPr>
+          <w:color w:val="64748B"/>
+          <w:sz w:val="17"/>
+        </w:rPr>
+        <w:t>图 14 操作日志：按模块、关键字、时间过滤并导出</w:t>
+      </w:r>
+    </w:p>
+    <w:p>
+      <w:pPr>
+        <w:pStyle w:val="Heading1"/>
+      </w:pPr>
+      <w:r>
+        <w:t>11. 常见问题</w:t>
+      </w:r>
+    </w:p>
+    <w:tbl>
+      <w:tblPr>
+        <w:tblStyle w:val="TableGrid"/>
+        <w:tblW w:type="auto" w:w="0"/>
+        <w:tblLayout w:type="autofit"/>
+        <w:tblLook w:firstColumn="1" w:firstRow="1" w:lastColumn="0" w:lastRow="0" w:noHBand="0" w:noVBand="1" w:val="04A0"/>
+      </w:tblPr>
+      <w:tblGrid>
+        <w:gridCol w:w="3264"/>
+        <w:gridCol w:w="3264"/>
+        <w:gridCol w:w="3264"/>
+      </w:tblGrid>
+      <w:tr>
+        <w:tc>
+          <w:tcPr>
+            <w:tcW w:type="dxa" w:w="3264"/>
             <w:shd w:fill="F2F4F7"/>
             <w:vAlign w:val="center"/>
           </w:tcPr>
@@ -163,7 +2082,24 @@
         </w:tc>
         <w:tc>
           <w:tcPr>
-            <w:tcW w:type="dxa" w:w="4896"/>
+            <w:tcW w:type="dxa" w:w="3264"/>
+            <w:shd w:fill="F2F4F7"/>
+            <w:vAlign w:val="center"/>
+          </w:tcPr>
+          <w:p>
+            <w:r/>
+            <w:r>
+              <w:rPr>
+                <w:b/>
+                <w:sz w:val="18"/>
+              </w:rPr>
+              <w:t>原因</w:t>
+            </w:r>
+          </w:p>
+        </w:tc>
+        <w:tc>
+          <w:tcPr>
+            <w:tcW w:type="dxa" w:w="3264"/>
             <w:shd w:fill="F2F4F7"/>
             <w:vAlign w:val="center"/>
           </w:tcPr>
@@ -182,7 +2118,7 @@
       <w:tr>
         <w:tc>
           <w:tcPr>
-            <w:tcW w:type="dxa" w:w="4896"/>
+            <w:tcW w:type="dxa" w:w="3264"/>
             <w:vAlign w:val="center"/>
           </w:tcPr>
           <w:p>
@@ -198,7 +2134,7 @@
         </w:tc>
         <w:tc>
           <w:tcPr>
-            <w:tcW w:type="dxa" w:w="4896"/>
+            <w:tcW w:type="dxa" w:w="3264"/>
             <w:vAlign w:val="center"/>
           </w:tcPr>
           <w:p>
@@ -208,7 +2144,23 @@
                 <w:b w:val="0"/>
                 <w:sz w:val="18"/>
               </w:rPr>
-              <w:t>联系管理员分配角色权限</w:t>
+              <w:t>账号没有对应角色或权限点</w:t>
+            </w:r>
+          </w:p>
+        </w:tc>
+        <w:tc>
+          <w:tcPr>
+            <w:tcW w:type="dxa" w:w="3264"/>
+            <w:vAlign w:val="center"/>
+          </w:tcPr>
+          <w:p>
+            <w:r/>
+            <w:r>
+              <w:rPr>
+                <w:b w:val="0"/>
+                <w:sz w:val="18"/>
+              </w:rPr>
+              <w:t>联系管理员在用户管理/角色管理中分配权限</w:t>
             </w:r>
           </w:p>
         </w:tc>
@@ -216,7 +2168,157 @@
       <w:tr>
         <w:tc>
           <w:tcPr>
-            <w:tcW w:type="dxa" w:w="4896"/>
+            <w:tcW w:type="dxa" w:w="3264"/>
+            <w:vAlign w:val="center"/>
+          </w:tcPr>
+          <w:p>
+            <w:r/>
+            <w:r>
+              <w:rPr>
+                <w:b w:val="0"/>
+                <w:sz w:val="18"/>
+              </w:rPr>
+              <w:t>直接访问页面被跳回工作台</w:t>
+            </w:r>
+          </w:p>
+        </w:tc>
+        <w:tc>
+          <w:tcPr>
+            <w:tcW w:type="dxa" w:w="3264"/>
+            <w:vAlign w:val="center"/>
+          </w:tcPr>
+          <w:p>
+            <w:r/>
+            <w:r>
+              <w:rPr>
+                <w:b w:val="0"/>
+                <w:sz w:val="18"/>
+              </w:rPr>
+              <w:t>前端路由权限不满足</w:t>
+            </w:r>
+          </w:p>
+        </w:tc>
+        <w:tc>
+          <w:tcPr>
+            <w:tcW w:type="dxa" w:w="3264"/>
+            <w:vAlign w:val="center"/>
+          </w:tcPr>
+          <w:p>
+            <w:r/>
+            <w:r>
+              <w:rPr>
+                <w:b w:val="0"/>
+                <w:sz w:val="18"/>
+              </w:rPr>
+              <w:t>确认当前用户是否拥有页面 meta.permission 要求的权限</w:t>
+            </w:r>
+          </w:p>
+        </w:tc>
+      </w:tr>
+      <w:tr>
+        <w:tc>
+          <w:tcPr>
+            <w:tcW w:type="dxa" w:w="3264"/>
+            <w:vAlign w:val="center"/>
+          </w:tcPr>
+          <w:p>
+            <w:r/>
+            <w:r>
+              <w:rPr>
+                <w:b w:val="0"/>
+                <w:sz w:val="18"/>
+              </w:rPr>
+              <w:t>接口返回 401</w:t>
+            </w:r>
+          </w:p>
+        </w:tc>
+        <w:tc>
+          <w:tcPr>
+            <w:tcW w:type="dxa" w:w="3264"/>
+            <w:vAlign w:val="center"/>
+          </w:tcPr>
+          <w:p>
+            <w:r/>
+            <w:r>
+              <w:rPr>
+                <w:b w:val="0"/>
+                <w:sz w:val="18"/>
+              </w:rPr>
+              <w:t>JWT 缺失、过期或未登录</w:t>
+            </w:r>
+          </w:p>
+        </w:tc>
+        <w:tc>
+          <w:tcPr>
+            <w:tcW w:type="dxa" w:w="3264"/>
+            <w:vAlign w:val="center"/>
+          </w:tcPr>
+          <w:p>
+            <w:r/>
+            <w:r>
+              <w:rPr>
+                <w:b w:val="0"/>
+                <w:sz w:val="18"/>
+              </w:rPr>
+              <w:t>重新登录，检查浏览器 sessionStorage 中 token 是否存在</w:t>
+            </w:r>
+          </w:p>
+        </w:tc>
+      </w:tr>
+      <w:tr>
+        <w:tc>
+          <w:tcPr>
+            <w:tcW w:type="dxa" w:w="3264"/>
+            <w:vAlign w:val="center"/>
+          </w:tcPr>
+          <w:p>
+            <w:r/>
+            <w:r>
+              <w:rPr>
+                <w:b w:val="0"/>
+                <w:sz w:val="18"/>
+              </w:rPr>
+              <w:t>接口返回 403</w:t>
+            </w:r>
+          </w:p>
+        </w:tc>
+        <w:tc>
+          <w:tcPr>
+            <w:tcW w:type="dxa" w:w="3264"/>
+            <w:vAlign w:val="center"/>
+          </w:tcPr>
+          <w:p>
+            <w:r/>
+            <w:r>
+              <w:rPr>
+                <w:b w:val="0"/>
+                <w:sz w:val="18"/>
+              </w:rPr>
+              <w:t>后端 @RequirePermission 拦截</w:t>
+            </w:r>
+          </w:p>
+        </w:tc>
+        <w:tc>
+          <w:tcPr>
+            <w:tcW w:type="dxa" w:w="3264"/>
+            <w:vAlign w:val="center"/>
+          </w:tcPr>
+          <w:p>
+            <w:r/>
+            <w:r>
+              <w:rPr>
+                <w:b w:val="0"/>
+                <w:sz w:val="18"/>
+              </w:rPr>
+              <w:t>使用具备相应业务权限的账号操作</w:t>
+            </w:r>
+          </w:p>
+        </w:tc>
+      </w:tr>
+      <w:tr>
+        <w:tc>
+          <w:tcPr>
+            <w:tcW w:type="dxa" w:w="3264"/>
             <w:vAlign w:val="center"/>
           </w:tcPr>
           <w:p>
@@ -232,7 +2334,7 @@
         </w:tc>
         <w:tc>
           <w:tcPr>
-            <w:tcW w:type="dxa" w:w="4896"/>
+            <w:tcW w:type="dxa" w:w="3264"/>
             <w:vAlign w:val="center"/>
           </w:tcPr>
           <w:p>
@@ -242,7 +2344,23 @@
                 <w:b w:val="0"/>
                 <w:sz w:val="18"/>
               </w:rPr>
-              <w:t>检查文件类型、大小和当前合同状态</w:t>
+              <w:t>文件过大、扩展名不支持或文件内容签名不匹配</w:t>
+            </w:r>
+          </w:p>
+        </w:tc>
+        <w:tc>
+          <w:tcPr>
+            <w:tcW w:type="dxa" w:w="3264"/>
+            <w:vAlign w:val="center"/>
+          </w:tcPr>
+          <w:p>
+            <w:r/>
+            <w:r>
+              <w:rPr>
+                <w:b w:val="0"/>
+                <w:sz w:val="18"/>
+              </w:rPr>
+              <w:t>确认文件小于 10MB 且内容与扩展名一致</w:t>
             </w:r>
           </w:p>
         </w:tc>
@@ -250,7 +2368,7 @@
       <w:tr>
         <w:tc>
           <w:tcPr>
-            <w:tcW w:type="dxa" w:w="4896"/>
+            <w:tcW w:type="dxa" w:w="3264"/>
             <w:vAlign w:val="center"/>
           </w:tcPr>
           <w:p>
@@ -266,7 +2384,7 @@
         </w:tc>
         <w:tc>
           <w:tcPr>
-            <w:tcW w:type="dxa" w:w="4896"/>
+            <w:tcW w:type="dxa" w:w="3264"/>
             <w:vAlign w:val="center"/>
           </w:tcPr>
           <w:p>
@@ -276,15 +2394,13 @@
                 <w:b w:val="0"/>
                 <w:sz w:val="18"/>
               </w:rPr>
-              <w:t>任务可能已处理或被新轮次封存，到合同详情查看时间线</w:t>
+              <w:t>任务已处理、被撤回或被新轮次封存</w:t>
             </w:r>
           </w:p>
         </w:tc>
-      </w:tr>
-      <w:tr>
         <w:tc>
           <w:tcPr>
-            <w:tcW w:type="dxa" w:w="4896"/>
+            <w:tcW w:type="dxa" w:w="3264"/>
             <w:vAlign w:val="center"/>
           </w:tcPr>
           <w:p>
@@ -294,13 +2410,15 @@
                 <w:b w:val="0"/>
                 <w:sz w:val="18"/>
               </w:rPr>
-              <w:t>端口占用</w:t>
+              <w:t>到合同详情的回退模型/流程任务页查看历史轮和当前轮</w:t>
             </w:r>
           </w:p>
         </w:tc>
+      </w:tr>
+      <w:tr>
         <w:tc>
           <w:tcPr>
-            <w:tcW w:type="dxa" w:w="4896"/>
+            <w:tcW w:type="dxa" w:w="3264"/>
             <w:vAlign w:val="center"/>
           </w:tcPr>
           <w:p>
@@ -310,7 +2428,89 @@
                 <w:b w:val="0"/>
                 <w:sz w:val="18"/>
               </w:rPr>
-              <w:t>使用 start-demo.ps1 的 BackendPort 和 FrontendPort 参数</w:t>
+              <w:t>打回后不能恢复</w:t>
+            </w:r>
+          </w:p>
+        </w:tc>
+        <w:tc>
+          <w:tcPr>
+            <w:tcW w:type="dxa" w:w="3264"/>
+            <w:vAlign w:val="center"/>
+          </w:tcPr>
+          <w:p>
+            <w:r/>
+            <w:r>
+              <w:rPr>
+                <w:b w:val="0"/>
+                <w:sz w:val="18"/>
+              </w:rPr>
+              <w:t>当前用户不是起草人，或缺少 contract:update 权限</w:t>
+            </w:r>
+          </w:p>
+        </w:tc>
+        <w:tc>
+          <w:tcPr>
+            <w:tcW w:type="dxa" w:w="3264"/>
+            <w:vAlign w:val="center"/>
+          </w:tcPr>
+          <w:p>
+            <w:r/>
+            <w:r>
+              <w:rPr>
+                <w:b w:val="0"/>
+                <w:sz w:val="18"/>
+              </w:rPr>
+              <w:t>切换起草人账号，确认合同处于已打回或可恢复草稿状态</w:t>
+            </w:r>
+          </w:p>
+        </w:tc>
+      </w:tr>
+      <w:tr>
+        <w:tc>
+          <w:tcPr>
+            <w:tcW w:type="dxa" w:w="3264"/>
+            <w:vAlign w:val="center"/>
+          </w:tcPr>
+          <w:p>
+            <w:r/>
+            <w:r>
+              <w:rPr>
+                <w:b w:val="0"/>
+                <w:sz w:val="18"/>
+              </w:rPr>
+              <w:t>签订后不能再编辑</w:t>
+            </w:r>
+          </w:p>
+        </w:tc>
+        <w:tc>
+          <w:tcPr>
+            <w:tcW w:type="dxa" w:w="3264"/>
+            <w:vAlign w:val="center"/>
+          </w:tcPr>
+          <w:p>
+            <w:r/>
+            <w:r>
+              <w:rPr>
+                <w:b w:val="0"/>
+                <w:sz w:val="18"/>
+              </w:rPr>
+              <w:t>已签订合同为流程终态</w:t>
+            </w:r>
+          </w:p>
+        </w:tc>
+        <w:tc>
+          <w:tcPr>
+            <w:tcW w:type="dxa" w:w="3264"/>
+            <w:vAlign w:val="center"/>
+          </w:tcPr>
+          <w:p>
+            <w:r/>
+            <w:r>
+              <w:rPr>
+                <w:b w:val="0"/>
+                <w:sz w:val="18"/>
+              </w:rPr>
+              <w:t>只能查看详情、时间线、版本和附件，不能继续修改流程</w:t>
             </w:r>
           </w:p>
         </w:tc>

</xml_diff>